<commit_message>
Improve article layout and TOC handling for articles
Refactors HTML structure for 'carbon-crediting-and-the-voluntary-carbon-market.html' and 'counting-megawatts-missing-people.html' to use a consistent article layout with a sticky table of contents (TOC) and main content area. Adds logic to collapse the TOC column if empty or hidden, updates meta descriptions, and improves mobile responsiveness and sticky TOC behavior in style.css. Updates associated .docx files for inline rendering.
</commit_message>
<xml_diff>
--- a/assets/Carbon Crediting and the Voluntary Carbon Market.docx
+++ b/assets/Carbon Crediting and the Voluntary Carbon Market.docx
@@ -12,17 +12,9 @@
     </w:p>
     <w:p>
       <w:pPr>
-        <w:jc w:val="both"/>
-        <w:rPr>
-          <w:b/>
-          <w:bCs/>
-        </w:rPr>
-      </w:pPr>
-      <w:r>
-        <w:rPr>
-          <w:b/>
-          <w:bCs/>
-        </w:rPr>
+        <w:pStyle w:val="Heading2"/>
+      </w:pPr>
+      <w:r>
         <w:t>Regulated versus uncovered emissions</w:t>
       </w:r>
     </w:p>
@@ -253,19 +245,45 @@
     </w:p>
     <w:p>
       <w:pPr>
+        <w:pStyle w:val="Heading2"/>
+      </w:pPr>
+      <w:r>
+        <w:t>How does the VCM work?</w:t>
+      </w:r>
+    </w:p>
+    <w:p>
+      <w:pPr>
         <w:spacing w:after="0"/>
         <w:jc w:val="both"/>
+      </w:pPr>
+    </w:p>
+    <w:p>
+      <w:pPr>
+        <w:spacing w:after="0"/>
+        <w:jc w:val="both"/>
+      </w:pPr>
+      <w:r>
+        <w:t xml:space="preserve">Each carbon credit represents one tonne of CO₂ (or equivalent GHG) that has been either </w:t>
+      </w:r>
+      <w:r>
         <w:rPr>
           <w:b/>
           <w:bCs/>
         </w:rPr>
-      </w:pPr>
+        <w:t>avoided</w:t>
+      </w:r>
+      <w:r>
+        <w:t xml:space="preserve"> (prevented from being emitted) or </w:t>
+      </w:r>
       <w:r>
         <w:rPr>
           <w:b/>
           <w:bCs/>
         </w:rPr>
-        <w:t>How does the VCM work?</w:t>
+        <w:t>removed</w:t>
+      </w:r>
+      <w:r>
+        <w:t xml:space="preserve"> (taken out of the atmosphere).</w:t>
       </w:r>
     </w:p>
     <w:p>
@@ -280,81 +298,39 @@
         <w:jc w:val="both"/>
       </w:pPr>
       <w:r>
-        <w:t xml:space="preserve">Each carbon credit represents one tonne of CO₂ (or equivalent GHG) that has been either </w:t>
-      </w:r>
-      <w:r>
+        <w:t>Project developers — such as those running reforestation initiatives, renewable energy installations, or cookstove programmes — can issue credits if their projects are verified by independent standards such as Verra or Gold Standard. Buyers, often companies with climate targets, purchase and then “retire” these credits so they cannot be reused.</w:t>
+      </w:r>
+    </w:p>
+    <w:p>
+      <w:pPr>
+        <w:spacing w:after="0"/>
+        <w:jc w:val="both"/>
+      </w:pPr>
+    </w:p>
+    <w:p>
+      <w:pPr>
+        <w:spacing w:after="0"/>
+        <w:jc w:val="both"/>
+      </w:pPr>
+      <w:r>
+        <w:lastRenderedPageBreak/>
+        <w:t>In essence, the VCM mirrors a regulated market but operates voluntarily. It provides a mechanism for private actors to take responsibility for residual emissions and for projects to access funding that might not otherwise exist.</w:t>
+      </w:r>
+    </w:p>
+    <w:p>
+      <w:pPr>
+        <w:jc w:val="both"/>
         <w:rPr>
           <w:b/>
           <w:bCs/>
         </w:rPr>
-        <w:t>avoided</w:t>
-      </w:r>
-      <w:r>
-        <w:t xml:space="preserve"> (prevented from being emitted) or </w:t>
-      </w:r>
-      <w:r>
-        <w:rPr>
-          <w:b/>
-          <w:bCs/>
-        </w:rPr>
-        <w:t>removed</w:t>
-      </w:r>
-      <w:r>
-        <w:t xml:space="preserve"> (taken out of the atmosphere).</w:t>
-      </w:r>
-    </w:p>
-    <w:p>
-      <w:pPr>
-        <w:spacing w:after="0"/>
-        <w:jc w:val="both"/>
-      </w:pPr>
-    </w:p>
-    <w:p>
-      <w:pPr>
-        <w:spacing w:after="0"/>
-        <w:jc w:val="both"/>
-      </w:pPr>
-      <w:r>
-        <w:t>Project developers — such as those running reforestation initiatives, renewable energy installations, or cookstove programmes — can issue credits if their projects are verified by independent standards such as Verra or Gold Standard. Buyers, often companies with climate targets, purchase and then “retire” these credits so they cannot be reused.</w:t>
-      </w:r>
-    </w:p>
-    <w:p>
-      <w:pPr>
-        <w:spacing w:after="0"/>
-        <w:jc w:val="both"/>
-      </w:pPr>
-    </w:p>
-    <w:p>
-      <w:pPr>
-        <w:spacing w:after="0"/>
-        <w:jc w:val="both"/>
-      </w:pPr>
-      <w:r>
-        <w:t>In essence, the VCM mirrors a regulated market but operates voluntarily. It provides a mechanism for private actors to take responsibility for residual emissions and for projects to access funding that might not otherwise exist.</w:t>
-      </w:r>
-    </w:p>
-    <w:p>
-      <w:pPr>
-        <w:jc w:val="both"/>
-        <w:rPr>
-          <w:b/>
-          <w:bCs/>
-        </w:rPr>
-      </w:pPr>
-    </w:p>
-    <w:p>
-      <w:pPr>
-        <w:jc w:val="both"/>
-        <w:rPr>
-          <w:b/>
-          <w:bCs/>
-        </w:rPr>
-      </w:pPr>
-      <w:r>
-        <w:rPr>
-          <w:b/>
-          <w:bCs/>
-        </w:rPr>
+      </w:pPr>
+    </w:p>
+    <w:p>
+      <w:pPr>
+        <w:pStyle w:val="Heading2"/>
+      </w:pPr>
+      <w:r>
         <w:t>Why does the VCM matter?</w:t>
       </w:r>
     </w:p>
@@ -562,7 +538,11 @@
         <w:jc w:val="both"/>
       </w:pPr>
       <w:r>
-        <w:t>For example, in March 2024, a Dutch court ruled that KLM’s advertising was misleading. The court found that 15 of 19 environmental claims – including ones about reforestation, sustainable aviation fuel (SAF), and “carbon-neutral” flights – were too vague and gave the false impression that flying with KLM was or could be sustainable.</w:t>
+        <w:t xml:space="preserve">For example, in March 2024, a Dutch court ruled that KLM’s advertising was misleading. The court found that 15 of 19 environmental claims – including ones about reforestation, </w:t>
+      </w:r>
+      <w:r>
+        <w:lastRenderedPageBreak/>
+        <w:t>sustainable aviation fuel (SAF), and “carbon-neutral” flights – were too vague and gave the false impression that flying with KLM was or could be sustainable.</w:t>
       </w:r>
       <w:r>
         <w:rPr>
@@ -573,17 +553,9 @@
     </w:p>
     <w:p>
       <w:pPr>
-        <w:jc w:val="both"/>
-        <w:rPr>
-          <w:b/>
-          <w:bCs/>
-        </w:rPr>
-      </w:pPr>
-      <w:r>
-        <w:rPr>
-          <w:b/>
-          <w:bCs/>
-        </w:rPr>
+        <w:pStyle w:val="Heading2"/>
+      </w:pPr>
+      <w:r>
         <w:t>The VCM today</w:t>
       </w:r>
     </w:p>
@@ -592,7 +564,6 @@
         <w:jc w:val="both"/>
       </w:pPr>
       <w:r>
-        <w:lastRenderedPageBreak/>
         <w:t>Despite its controversies, the market is already active and expanding. In 2023, offset programmes drew nearly USD 2 billion as firms sought to compensate for emissions from factories, flights, logistics, and more.</w:t>
       </w:r>
       <w:r>
@@ -624,17 +595,9 @@
     </w:p>
     <w:p>
       <w:pPr>
-        <w:jc w:val="both"/>
-        <w:rPr>
-          <w:b/>
-          <w:bCs/>
-        </w:rPr>
-      </w:pPr>
-      <w:r>
-        <w:rPr>
-          <w:b/>
-          <w:bCs/>
-        </w:rPr>
+        <w:pStyle w:val="Heading2"/>
+      </w:pPr>
+      <w:r>
         <w:t>VCM Taxonomy</w:t>
       </w:r>
     </w:p>
@@ -946,6 +909,7 @@
               <w:jc w:val="both"/>
             </w:pPr>
             <w:r>
+              <w:lastRenderedPageBreak/>
               <w:t>Technology-based removals</w:t>
             </w:r>
           </w:p>
@@ -1026,11 +990,7 @@
               <w:jc w:val="both"/>
             </w:pPr>
             <w:r>
-              <w:t xml:space="preserve">Early coal retirement, industrial </w:t>
-            </w:r>
-            <w:r>
-              <w:lastRenderedPageBreak/>
-              <w:t>retrofits, energy efficiency upgrades</w:t>
+              <w:t>Early coal retirement, industrial retrofits, energy efficiency upgrades</w:t>
             </w:r>
           </w:p>
         </w:tc>
@@ -1043,7 +1003,6 @@
               <w:jc w:val="both"/>
             </w:pPr>
             <w:r>
-              <w:lastRenderedPageBreak/>
               <w:t>Variable</w:t>
             </w:r>
           </w:p>
@@ -1070,11 +1029,7 @@
               <w:jc w:val="both"/>
             </w:pPr>
             <w:r>
-              <w:t xml:space="preserve">Baseline integrity, double </w:t>
-            </w:r>
-            <w:r>
-              <w:lastRenderedPageBreak/>
-              <w:t>counting, political risk</w:t>
+              <w:t>Baseline integrity, double counting, political risk</w:t>
             </w:r>
           </w:p>
         </w:tc>
@@ -1087,17 +1042,9 @@
     </w:p>
     <w:p>
       <w:pPr>
-        <w:jc w:val="both"/>
-        <w:rPr>
-          <w:b/>
-          <w:bCs/>
-        </w:rPr>
-      </w:pPr>
-      <w:r>
-        <w:rPr>
-          <w:b/>
-          <w:bCs/>
-        </w:rPr>
+        <w:pStyle w:val="Heading2"/>
+      </w:pPr>
+      <w:r>
         <w:t>The market at a crossroads</w:t>
       </w:r>
     </w:p>
@@ -1316,15 +1263,7 @@
           <w:sz w:val="20"/>
           <w:szCs w:val="20"/>
         </w:rPr>
-        <w:t xml:space="preserve"> Kleinman </w:t>
-      </w:r>
-      <w:r>
-        <w:rPr>
-          <w:color w:val="000000"/>
-          <w:sz w:val="20"/>
-          <w:szCs w:val="20"/>
-        </w:rPr>
-        <w:t>Center for Energy Policy</w:t>
+        <w:t xml:space="preserve"> Kleinman Center for Energy Policy</w:t>
       </w:r>
     </w:p>
   </w:footnote>
@@ -1909,7 +1848,6 @@
     <w:next w:val="Normal"/>
     <w:link w:val="Heading2Char"/>
     <w:uiPriority w:val="9"/>
-    <w:semiHidden/>
     <w:unhideWhenUsed/>
     <w:qFormat/>
     <w:rsid w:val="00D634FC"/>
@@ -2124,7 +2062,6 @@
     <w:basedOn w:val="DefaultParagraphFont"/>
     <w:link w:val="Heading2"/>
     <w:uiPriority w:val="9"/>
-    <w:semiHidden/>
     <w:rsid w:val="00D634FC"/>
     <w:rPr>
       <w:rFonts w:asciiTheme="majorHAnsi" w:eastAsiaTheme="majorEastAsia" w:hAnsiTheme="majorHAnsi" w:cstheme="majorBidi"/>

</xml_diff>